<commit_message>
feat: tambahkan section arsitektur model dan koding di web, serta perbarui Laporan Project dan Paper Jurnal (PDF & DOCX)
</commit_message>
<xml_diff>
--- a/docs/docx/Laporan_Project.docx
+++ b/docs/docx/Laporan_Project.docx
@@ -554,6 +554,22 @@
       </w:tr>
     </w:tbl>
     <w:p/>
+    <w:p>
+      <w:pPr>
+        <w:pStyle w:val="Heading2"/>
+      </w:pPr>
+      <w:r>
+        <w:t>3.2 Implementasi Kode Sumber &amp; Arsitektur Model</w:t>
+      </w:r>
+    </w:p>
+    <w:p>
+      <w:r>
+        <w:t>Model dilatih menggunakan Python 3.10 dan pustaka scikit-learn dengan pipeline yang terdokumentasi rapi di ml/train.py. Ekstraksi fitur menggunakan TfidfVectorizer(ngram_range=(1,2), max_features=15000), diikuti inisialisasi LinearSVC(C=0.5, class_weight='balanced') dan MultinomialNB(alpha=0.3).</w:t>
+        <w:br/>
+        <w:br/>
+        <w:t>Matriks bobot model kemudian diekspor ke file web/model/model.json yang memuat 15.000 kata leksikon, nilai IDF, koefisien SVM (3 x 15.000), dan nilai bias (intercept). Pada sisi peramban web (web/inference.js), JavaScript menghitung perkalian titik sparse dot-product dan fungsi Softmax secara mandiri. Hal ini mewujudkan inferensi AI 100% luring (offline) tanpa dependensi server, memangkas latensi menjadi di bawah 3 milidetik per tweet, serta menjaga privasi teks pengguna secara penuh.</w:t>
+      </w:r>
+    </w:p>
     <w:p>
       <w:pPr>
         <w:pStyle w:val="Heading1"/>

</xml_diff>

<commit_message>
feat: perbarui tahun seluruh dokumen menjadi 2026, tambahkan afiliasi akademik Departemen Ilmu Komputer di Paper & Laporan, serta sematkan animasi interaktif di web
</commit_message>
<xml_diff>
--- a/docs/docx/Laporan_Project.docx
+++ b/docs/docx/Laporan_Project.docx
@@ -34,11 +34,13 @@
           <w:color w:val="64748B"/>
           <w:sz w:val="18"/>
         </w:rPr>
-        <w:t>Disusun oleh: SteVenJr | Program Studi: Teknik Informatika / Sains Data</w:t>
+        <w:t>Disusun oleh: SteVenJr | Departemen Ilmu Komputer, Fakultas Ilmu Komputer dan TI</w:t>
+        <w:br/>
+        <w:t>Laboratorium Sains Data, AI &amp; NLP SentimentGreen | Tahun Akademik: 2026</w:t>
         <w:br/>
         <w:t>Dataset: Twitter Climate Change Sentiment Dataset (Kaggle: Edward Qian)</w:t>
         <w:br/>
-        <w:t>Aplikasi Web: https://sentimentgreen.vercel.app | Tahun: 2026</w:t>
+        <w:t>Aplikasi Web: https://sentimentgreen.vercel.app | Repositori: github.com/stevenjr-yt/sentimen-ekonomi-hijau</w:t>
         <w:br/>
       </w:r>
     </w:p>

</xml_diff>

<commit_message>
fix: ganti copyright web jadi 2026 dan format simbol matematika standar (KaTeX, sigma, pi, akar) di web, paper, dan laporan
</commit_message>
<xml_diff>
--- a/docs/docx/Laporan_Project.docx
+++ b/docs/docx/Laporan_Project.docx
@@ -199,15 +199,15 @@
       <w:r>
         <w:t>TF-IDF (Term Frequency - Inverse Document Frequency) adalah metode pembobotan statistik yang mengukur signifikansi relatif sebuah term t dalam dokumen d terhadap kumpulan korpus N dokumen:</w:t>
         <w:br/>
-        <w:t>1. TF(t, d) = f(t, d) / [ Σ_{t' in d} f(t', d) ]</w:t>
+        <w:t>1. TF(t, d) = f(t, d) / [ ∑_{t' ∈ d} f(t', d) ]</w:t>
         <w:br/>
         <w:t>2. IDF(t) = ln [ (1 + N) / (1 + df(t)) ] + 1</w:t>
         <w:br/>
-        <w:t>3. Bobot Mentah: v(t, d) = TF(t, d) * IDF(t)</w:t>
+        <w:t>3. Bobot Mentah: v(t, d) = TF(t, d) × IDF(t)</w:t>
         <w:br/>
-        <w:t>4. Normalisasi L2 (Euclidean Norm): v_norm = v / sqrt(Σ v_i^2)</w:t>
+        <w:t>4. Normalisasi Euclidean L2: v_norm = v / ||v||₂ = v / √( ∑_{i=1}^{M} vᵢ² )</w:t>
         <w:br/>
-        <w:t>Akar kuadrat (sqrt) berfungsi sebagai normalisasi panjang vektor agar tweet pendek dan tweet panjang dinilai secara adil berdasarkan proporsi makna, bukan panjang karakter.</w:t>
+        <w:t>Simbol akar kuadrat (√) berfungsi sebagai normalisasi panjang Euclidean vektor panah (Teorema Pythagoras) agar tweet pendek dan tweet panjang dinilai secara adil berdasarkan proporsi makna, bukan panjang karakter.</w:t>
       </w:r>
     </w:p>
     <w:p>
@@ -222,11 +222,11 @@
       <w:r>
         <w:t>Berdasarkan Teorema Bayes dengan asumsi independensi bersyarat fitur dan Laplace Smoothing α = 0.3:</w:t>
         <w:br/>
-        <w:t>P(c | d) ∝ P(c) * Π_{i=1}^{n} P(w_i | c)</w:t>
+        <w:t>P(c | d) ∝ P(c) × ∏_{i=1}^{n} P(wᵢ | c)</w:t>
         <w:br/>
-        <w:t>P(w_i | c) = [ N_{w_i, c} + 0.3 ] / [ N_c + 0.3 * |V| ]</w:t>
+        <w:t>P(wᵢ | c) = [ N_{wᵢ, c} + 0.3 ] / [ N_c + 0.3 · |V| ]</w:t>
         <w:br/>
-        <w:t>Klasifikasi: c_pred = argmax_c [ log P(c) + Σ log P(w_i | c) ]</w:t>
+        <w:t>Fungsi Klasifikasi: c* = argmax_{c ∈ C} [ ln P(c) + ∑_{i=1}^{n} ln P(wᵢ | c) ]</w:t>
       </w:r>
     </w:p>
     <w:p>
@@ -239,15 +239,15 @@
     </w:p>
     <w:p>
       <w:r>
-        <w:t>Linear SVM mencari hyperplane optimal w^T * x + b = 0 dengan margin maksimal 2 / ||w|| melalui formulasi optimasi soft-margin berbobot seimbang:</w:t>
+        <w:t>Linear SVM mencari hyperplane optimal wᵀ · x + b = 0 dengan margin maksimal 2 / ||w|| melalui formulasi optimasi soft-margin berbobot seimbang:</w:t>
         <w:br/>
-        <w:t>min_{w, b, ξ} [ (1/2) * ||w||^2 + C * Σ W_{y_i} * ξ_i ]</w:t>
+        <w:t>min_{w, b, ξ} [ (1/2) · ||w||² + C · ∑_{i=1}^{N} W_{yᵢ} · ξᵢ ]</w:t>
         <w:br/>
-        <w:t>Subject to: y_i * ( w^T * x_i + b ) &gt;= 1 - ξ_i,  ξ_i &gt;= 0</w:t>
+        <w:t>Subject to: yᵢ · ( wᵀ · xᵢ + b ) ≥ 1 - ξᵢ,  ξᵢ ≥ 0</w:t>
         <w:br/>
-        <w:t>Bobot Penyeimbang Kelas: W_c = N_total / [ K * N_c ] (K = 3 kelas)</w:t>
+        <w:t>Bobot Penyeimbang Kelas: W_c = N_total / [ K · N_c ] (K = 3 kelas)</w:t>
         <w:br/>
-        <w:t>Fungsi Keputusan (One-vs-Rest): c_pred = argmax_c [ w_c^T * x + b_c ]</w:t>
+        <w:t>Fungsi Keputusan (One-vs-Rest): c* = argmax_c [ w_cᵀ · x + b_c ]</w:t>
       </w:r>
     </w:p>
     <w:p>

</xml_diff>